<commit_message>
Deploy mainnet build with dist
</commit_message>
<xml_diff>
--- a/docs/功能测试文档.docx
+++ b/docs/功能测试文档.docx
@@ -36,16 +36,16 @@
     </w:p>
     <w:p/>
     <w:tbl>
-      <w:tblGrid>
-        <w:gridCol w:w="2015"/>
-        <w:gridCol w:w="9216"/>
-      </w:tblGrid>
       <w:tblPr>
         <w:tblW w:type="dxa" w:w="11232"/>
         <w:jc w:val="center"/>
         <w:tblLook w:firstColumn="1" w:firstRow="1" w:lastColumn="0" w:lastRow="0" w:noHBand="0" w:noVBand="1" w:val="04A0"/>
         <w:tblLayout w:type="fixed"/>
       </w:tblPr>
+      <w:tblGrid>
+        <w:gridCol w:w="2015"/>
+        <w:gridCol w:w="9216"/>
+      </w:tblGrid>
       <w:tr>
         <w:tc>
           <w:tcPr>
@@ -251,7 +251,7 @@
                 <w:color w:val="111827"/>
                 <w:sz w:val="19"/>
               </w:rPr>
-              <w:t>IronBrother DApp / Admin 后台 / BSC Testnet 合约</w:t>
+              <w:t>IronBrother DApp / Admin 后台 / BSC Mainnet 合约</w:t>
             </w:r>
           </w:p>
         </w:tc>
@@ -460,12 +460,6 @@
       </w:r>
     </w:p>
     <w:tbl>
-      <w:tblGrid>
-        <w:gridCol w:w="1944"/>
-        <w:gridCol w:w="3240"/>
-        <w:gridCol w:w="5184"/>
-        <w:gridCol w:w="4248"/>
-      </w:tblGrid>
       <w:tblPr>
         <w:tblStyle w:val="TableGrid"/>
         <w:tblW w:type="dxa" w:w="14616"/>
@@ -473,6 +467,12 @@
         <w:tblLook w:firstColumn="1" w:firstRow="1" w:lastColumn="0" w:lastRow="0" w:noHBand="0" w:noVBand="1" w:val="04A0"/>
         <w:tblLayout w:type="fixed"/>
       </w:tblPr>
+      <w:tblGrid>
+        <w:gridCol w:w="1944"/>
+        <w:gridCol w:w="3240"/>
+        <w:gridCol w:w="5184"/>
+        <w:gridCol w:w="4248"/>
+      </w:tblGrid>
       <w:tr>
         <w:tc>
           <w:tcPr>
@@ -680,7 +680,7 @@
                 <w:color w:val="111827"/>
                 <w:sz w:val="16"/>
               </w:rPr>
-              <w:t>暂定 BSC 链，做成 DApp</w:t>
+              <w:t>BSC Mainnet 链，做成 DApp</w:t>
             </w:r>
           </w:p>
         </w:tc>
@@ -714,7 +714,7 @@
                 <w:color w:val="111827"/>
                 <w:sz w:val="16"/>
               </w:rPr>
-              <w:t>前端使用 BSC Testnet；合约为 UUPS 可升级合约</w:t>
+              <w:t>前端使用 BSC Mainnet；合约为 UUPS 可升级合约</w:t>
             </w:r>
           </w:p>
         </w:tc>
@@ -2210,7 +2210,7 @@
                 <w:color w:val="111827"/>
                 <w:sz w:val="16"/>
               </w:rPr>
-              <w:t>每天流水满 1000U 为有效账户，按代数发放</w:t>
+              <w:t>有效门槛只用于计算有效直推和可拿代数；可拿代数内的所有下级质押流水都发放动态奖励</w:t>
             </w:r>
           </w:p>
         </w:tc>
@@ -2307,7 +2307,7 @@
                 <w:color w:val="111827"/>
                 <w:sz w:val="16"/>
               </w:rPr>
-              <w:t>低于/达到门槛、代数比例、重复结算</w:t>
+              <w:t>有效直推、低额质押、代数比例、重复结算</w:t>
             </w:r>
           </w:p>
         </w:tc>
@@ -3332,12 +3332,6 @@
       </w:r>
     </w:p>
     <w:tbl>
-      <w:tblGrid>
-        <w:gridCol w:w="1440"/>
-        <w:gridCol w:w="3744"/>
-        <w:gridCol w:w="5256"/>
-        <w:gridCol w:w="4176"/>
-      </w:tblGrid>
       <w:tblPr>
         <w:tblStyle w:val="TableGrid"/>
         <w:tblW w:type="dxa" w:w="14616"/>
@@ -3345,6 +3339,12 @@
         <w:tblLook w:firstColumn="1" w:firstRow="1" w:lastColumn="0" w:lastRow="0" w:noHBand="0" w:noVBand="1" w:val="04A0"/>
         <w:tblLayout w:type="fixed"/>
       </w:tblPr>
+      <w:tblGrid>
+        <w:gridCol w:w="1440"/>
+        <w:gridCol w:w="3744"/>
+        <w:gridCol w:w="5256"/>
+        <w:gridCol w:w="4176"/>
+      </w:tblGrid>
       <w:tr>
         <w:tc>
           <w:tcPr>
@@ -4323,10 +4323,6 @@
       </w:r>
     </w:p>
     <w:tbl>
-      <w:tblGrid>
-        <w:gridCol w:w="2880"/>
-        <w:gridCol w:w="11664"/>
-      </w:tblGrid>
       <w:tblPr>
         <w:tblStyle w:val="TableGrid"/>
         <w:tblW w:type="dxa" w:w="14544"/>
@@ -4334,6 +4330,10 @@
         <w:tblLook w:firstColumn="1" w:firstRow="1" w:lastColumn="0" w:lastRow="0" w:noHBand="0" w:noVBand="1" w:val="04A0"/>
         <w:tblLayout w:type="fixed"/>
       </w:tblPr>
+      <w:tblGrid>
+        <w:gridCol w:w="2880"/>
+        <w:gridCol w:w="11664"/>
+      </w:tblGrid>
       <w:tr>
         <w:tc>
           <w:tcPr>
@@ -4471,7 +4471,7 @@
                 <w:color w:val="111827"/>
                 <w:sz w:val="16"/>
               </w:rPr>
-              <w:t>BSC Testnet</w:t>
+              <w:t>BSC Mainnet</w:t>
             </w:r>
           </w:p>
         </w:tc>
@@ -4543,16 +4543,7 @@
                 <w:color w:val="111827"/>
                 <w:sz w:val="16"/>
               </w:rPr>
-              <w:t>Cloudflare Pages Preview：</w:t>
-            </w:r>
-            <w:r>
-              <w:rPr>
-                <w:rFonts w:ascii="Consolas" w:hAnsi="Consolas" w:eastAsia="Microsoft YaHei"/>
-                <w:b w:val="0"/>
-                <w:color w:val="0F766E"/>
-                <w:sz w:val="16"/>
-              </w:rPr>
-              <w:t>https://test.ironbrother.pages.dev</w:t>
+              <w:t>Cloudflare Pages Production</w:t>
             </w:r>
           </w:p>
         </w:tc>
@@ -4622,7 +4613,7 @@
                 <w:color w:val="0F766E"/>
                 <w:sz w:val="16"/>
               </w:rPr>
-              <w:t>0x5D8d8Fe47EcA5B2812194e3cD149CAAeb315e72E</w:t>
+              <w:t>0x25cCc567C5a72Bb164d0e75969ff6141a7d735E3</w:t>
             </w:r>
           </w:p>
         </w:tc>
@@ -4659,7 +4650,7 @@
                 <w:color w:val="111827"/>
                 <w:sz w:val="16"/>
               </w:rPr>
-              <w:t>测试 USDT</w:t>
+              <w:t>USDT</w:t>
             </w:r>
           </w:p>
         </w:tc>
@@ -4694,7 +4685,7 @@
                 <w:color w:val="0F766E"/>
                 <w:sz w:val="16"/>
               </w:rPr>
-              <w:t>0xacD944e910952c020eb129C50921f180c62c3291</w:t>
+              <w:t>0x55d398326f99059fF775485246999027B3197955</w:t>
             </w:r>
           </w:p>
         </w:tc>
@@ -4869,7 +4860,7 @@
           <w:b w:val="0"/>
           <w:sz w:val="20"/>
         </w:rPr>
-        <w:t>浏览器安装钱包插件，并切换到 BSC Testnet。</w:t>
+        <w:t>浏览器安装钱包插件，并切换到 BSC Mainnet。</w:t>
       </w:r>
     </w:p>
     <w:p>
@@ -4883,7 +4874,7 @@
           <w:b w:val="0"/>
           <w:sz w:val="20"/>
         </w:rPr>
-        <w:t>普通用户钱包有足够 Test USDT 和少量 Test BNB。</w:t>
+        <w:t>普通用户钱包有足够 USDT 和少量 BNB。</w:t>
       </w:r>
     </w:p>
     <w:p>
@@ -4897,7 +4888,7 @@
           <w:b w:val="0"/>
           <w:sz w:val="20"/>
         </w:rPr>
-        <w:t>Super Admin 钱包有足够 Test BNB，并对提现审批付款保留足够 Test USDT。</w:t>
+        <w:t>Super Admin 钱包有足够 BNB，并对提现审批付款保留足够 USDT。</w:t>
       </w:r>
     </w:p>
     <w:p>
@@ -5124,12 +5115,6 @@
       </w:r>
     </w:p>
     <w:tbl>
-      <w:tblGrid>
-        <w:gridCol w:w="1584"/>
-        <w:gridCol w:w="2880"/>
-        <w:gridCol w:w="4824"/>
-        <w:gridCol w:w="5328"/>
-      </w:tblGrid>
       <w:tblPr>
         <w:tblStyle w:val="TableGrid"/>
         <w:tblW w:type="dxa" w:w="14616"/>
@@ -5137,6 +5122,12 @@
         <w:tblLook w:firstColumn="1" w:firstRow="1" w:lastColumn="0" w:lastRow="0" w:noHBand="0" w:noVBand="1" w:val="04A0"/>
         <w:tblLayout w:type="fixed"/>
       </w:tblPr>
+      <w:tblGrid>
+        <w:gridCol w:w="1584"/>
+        <w:gridCol w:w="2880"/>
+        <w:gridCol w:w="4824"/>
+        <w:gridCol w:w="5328"/>
+      </w:tblGrid>
       <w:tr>
         <w:tc>
           <w:tcPr>
@@ -5519,7 +5510,7 @@
                 <w:color w:val="111827"/>
                 <w:sz w:val="16"/>
               </w:rPr>
-              <w:t>连接 BSC Testnet 钱包</w:t>
+              <w:t>连接 BSC Mainnet 钱包</w:t>
             </w:r>
           </w:p>
         </w:tc>
@@ -5658,7 +5649,7 @@
                 <w:color w:val="111827"/>
                 <w:sz w:val="16"/>
               </w:rPr>
-              <w:t>切换到非 BSC Testnet 网络</w:t>
+              <w:t>切换到非 BSC Mainnet 网络</w:t>
             </w:r>
           </w:p>
         </w:tc>
@@ -5875,12 +5866,6 @@
       </w:r>
     </w:p>
     <w:tbl>
-      <w:tblGrid>
-        <w:gridCol w:w="1584"/>
-        <w:gridCol w:w="2880"/>
-        <w:gridCol w:w="4824"/>
-        <w:gridCol w:w="5328"/>
-      </w:tblGrid>
       <w:tblPr>
         <w:tblStyle w:val="TableGrid"/>
         <w:tblW w:type="dxa" w:w="14616"/>
@@ -5888,6 +5873,12 @@
         <w:tblLook w:firstColumn="1" w:firstRow="1" w:lastColumn="0" w:lastRow="0" w:noHBand="0" w:noVBand="1" w:val="04A0"/>
         <w:tblLayout w:type="fixed"/>
       </w:tblPr>
+      <w:tblGrid>
+        <w:gridCol w:w="1584"/>
+        <w:gridCol w:w="2880"/>
+        <w:gridCol w:w="4824"/>
+        <w:gridCol w:w="5328"/>
+      </w:tblGrid>
       <w:tr>
         <w:tc>
           <w:tcPr>
@@ -7005,12 +6996,6 @@
       </w:r>
     </w:p>
     <w:tbl>
-      <w:tblGrid>
-        <w:gridCol w:w="1584"/>
-        <w:gridCol w:w="2880"/>
-        <w:gridCol w:w="4824"/>
-        <w:gridCol w:w="5328"/>
-      </w:tblGrid>
       <w:tblPr>
         <w:tblStyle w:val="TableGrid"/>
         <w:tblW w:type="dxa" w:w="14616"/>
@@ -7018,6 +7003,12 @@
         <w:tblLook w:firstColumn="1" w:firstRow="1" w:lastColumn="0" w:lastRow="0" w:noHBand="0" w:noVBand="1" w:val="04A0"/>
         <w:tblLayout w:type="fixed"/>
       </w:tblPr>
+      <w:tblGrid>
+        <w:gridCol w:w="1584"/>
+        <w:gridCol w:w="2880"/>
+        <w:gridCol w:w="4824"/>
+        <w:gridCol w:w="5328"/>
+      </w:tblGrid>
       <w:tr>
         <w:tc>
           <w:tcPr>
@@ -8298,12 +8289,6 @@
       </w:r>
     </w:p>
     <w:tbl>
-      <w:tblGrid>
-        <w:gridCol w:w="1584"/>
-        <w:gridCol w:w="2880"/>
-        <w:gridCol w:w="4824"/>
-        <w:gridCol w:w="5328"/>
-      </w:tblGrid>
       <w:tblPr>
         <w:tblStyle w:val="TableGrid"/>
         <w:tblW w:type="dxa" w:w="14616"/>
@@ -8311,6 +8296,12 @@
         <w:tblLook w:firstColumn="1" w:firstRow="1" w:lastColumn="0" w:lastRow="0" w:noHBand="0" w:noVBand="1" w:val="04A0"/>
         <w:tblLayout w:type="fixed"/>
       </w:tblPr>
+      <w:tblGrid>
+        <w:gridCol w:w="1584"/>
+        <w:gridCol w:w="2880"/>
+        <w:gridCol w:w="4824"/>
+        <w:gridCol w:w="5328"/>
+      </w:tblGrid>
       <w:tr>
         <w:tc>
           <w:tcPr>
@@ -9040,12 +9031,6 @@
       </w:r>
     </w:p>
     <w:tbl>
-      <w:tblGrid>
-        <w:gridCol w:w="1584"/>
-        <w:gridCol w:w="2880"/>
-        <w:gridCol w:w="4824"/>
-        <w:gridCol w:w="5328"/>
-      </w:tblGrid>
       <w:tblPr>
         <w:tblStyle w:val="TableGrid"/>
         <w:tblW w:type="dxa" w:w="14616"/>
@@ -9053,6 +9038,12 @@
         <w:tblLook w:firstColumn="1" w:firstRow="1" w:lastColumn="0" w:lastRow="0" w:noHBand="0" w:noVBand="1" w:val="04A0"/>
         <w:tblLayout w:type="fixed"/>
       </w:tblPr>
+      <w:tblGrid>
+        <w:gridCol w:w="1584"/>
+        <w:gridCol w:w="2880"/>
+        <w:gridCol w:w="4824"/>
+        <w:gridCol w:w="5328"/>
+      </w:tblGrid>
       <w:tr>
         <w:tc>
           <w:tcPr>
@@ -10507,12 +10498,6 @@
       </w:r>
     </w:p>
     <w:tbl>
-      <w:tblGrid>
-        <w:gridCol w:w="1584"/>
-        <w:gridCol w:w="2880"/>
-        <w:gridCol w:w="4824"/>
-        <w:gridCol w:w="5328"/>
-      </w:tblGrid>
       <w:tblPr>
         <w:tblStyle w:val="TableGrid"/>
         <w:tblW w:type="dxa" w:w="14616"/>
@@ -10520,6 +10505,12 @@
         <w:tblLook w:firstColumn="1" w:firstRow="1" w:lastColumn="0" w:lastRow="0" w:noHBand="0" w:noVBand="1" w:val="04A0"/>
         <w:tblLayout w:type="fixed"/>
       </w:tblPr>
+      <w:tblGrid>
+        <w:gridCol w:w="1584"/>
+        <w:gridCol w:w="2880"/>
+        <w:gridCol w:w="4824"/>
+        <w:gridCol w:w="5328"/>
+      </w:tblGrid>
       <w:tr>
         <w:tc>
           <w:tcPr>
@@ -10761,7 +10752,7 @@
                 <w:color w:val="111827"/>
                 <w:sz w:val="16"/>
               </w:rPr>
-              <w:t>下级当天累计带单 999U，次日结算动态</w:t>
+              <w:t>下级当天累计带单 999U，且上级没有有效直推资格</w:t>
             </w:r>
           </w:p>
         </w:tc>
@@ -10795,7 +10786,7 @@
                 <w:color w:val="111827"/>
                 <w:sz w:val="16"/>
               </w:rPr>
-              <w:t>上级无动态收益</w:t>
+              <w:t>下级不计入有效直推，上级无动态收益</w:t>
             </w:r>
           </w:p>
         </w:tc>
@@ -10867,7 +10858,7 @@
                 <w:color w:val="111827"/>
                 <w:sz w:val="16"/>
               </w:rPr>
-              <w:t>日流水达到门槛</w:t>
+              <w:t>低额质押参与动态</w:t>
             </w:r>
           </w:p>
         </w:tc>
@@ -10902,7 +10893,7 @@
                 <w:color w:val="111827"/>
                 <w:sz w:val="16"/>
               </w:rPr>
-              <w:t>下级当天累计带单 1000U，次日结算动态</w:t>
+              <w:t>上级已有可拿代数资格，下级当天累计带单低于 1000U</w:t>
             </w:r>
           </w:p>
         </w:tc>
@@ -10937,7 +10928,7 @@
                 <w:color w:val="111827"/>
                 <w:sz w:val="16"/>
               </w:rPr>
-              <w:t>上级按代数比例获得动态收益</w:t>
+              <w:t>上级仍按该下级实际流水和代数比例获得动态收益</w:t>
             </w:r>
           </w:p>
         </w:tc>
@@ -11951,7 +11942,7 @@
                 <w:color w:val="111827"/>
                 <w:sz w:val="16"/>
               </w:rPr>
-              <w:t>只结算有流水且未结算用户；有效用户发放奖励</w:t>
+              <w:t>只结算有流水且未结算用户；上级在可拿代数内则发放奖励</w:t>
             </w:r>
           </w:p>
         </w:tc>
@@ -11974,12 +11965,6 @@
       </w:r>
     </w:p>
     <w:tbl>
-      <w:tblGrid>
-        <w:gridCol w:w="1584"/>
-        <w:gridCol w:w="2880"/>
-        <w:gridCol w:w="4824"/>
-        <w:gridCol w:w="5328"/>
-      </w:tblGrid>
       <w:tblPr>
         <w:tblStyle w:val="TableGrid"/>
         <w:tblW w:type="dxa" w:w="14616"/>
@@ -11987,6 +11972,12 @@
         <w:tblLook w:firstColumn="1" w:firstRow="1" w:lastColumn="0" w:lastRow="0" w:noHBand="0" w:noVBand="1" w:val="04A0"/>
         <w:tblLayout w:type="fixed"/>
       </w:tblPr>
+      <w:tblGrid>
+        <w:gridCol w:w="1584"/>
+        <w:gridCol w:w="2880"/>
+        <w:gridCol w:w="4824"/>
+        <w:gridCol w:w="5328"/>
+      </w:tblGrid>
       <w:tr>
         <w:tc>
           <w:tcPr>
@@ -13267,12 +13258,6 @@
       </w:r>
     </w:p>
     <w:tbl>
-      <w:tblGrid>
-        <w:gridCol w:w="1584"/>
-        <w:gridCol w:w="2880"/>
-        <w:gridCol w:w="4824"/>
-        <w:gridCol w:w="5328"/>
-      </w:tblGrid>
       <w:tblPr>
         <w:tblStyle w:val="TableGrid"/>
         <w:tblW w:type="dxa" w:w="14616"/>
@@ -13280,6 +13265,12 @@
         <w:tblLook w:firstColumn="1" w:firstRow="1" w:lastColumn="0" w:lastRow="0" w:noHBand="0" w:noVBand="1" w:val="04A0"/>
         <w:tblLayout w:type="fixed"/>
       </w:tblPr>
+      <w:tblGrid>
+        <w:gridCol w:w="1584"/>
+        <w:gridCol w:w="2880"/>
+        <w:gridCol w:w="4824"/>
+        <w:gridCol w:w="5328"/>
+      </w:tblGrid>
       <w:tr>
         <w:tc>
           <w:tcPr>
@@ -14156,12 +14147,6 @@
       </w:r>
     </w:p>
     <w:tbl>
-      <w:tblGrid>
-        <w:gridCol w:w="1584"/>
-        <w:gridCol w:w="2880"/>
-        <w:gridCol w:w="4824"/>
-        <w:gridCol w:w="5328"/>
-      </w:tblGrid>
       <w:tblPr>
         <w:tblStyle w:val="TableGrid"/>
         <w:tblW w:type="dxa" w:w="14616"/>
@@ -14169,6 +14154,12 @@
         <w:tblLook w:firstColumn="1" w:firstRow="1" w:lastColumn="0" w:lastRow="0" w:noHBand="0" w:noVBand="1" w:val="04A0"/>
         <w:tblLayout w:type="fixed"/>
       </w:tblPr>
+      <w:tblGrid>
+        <w:gridCol w:w="1584"/>
+        <w:gridCol w:w="2880"/>
+        <w:gridCol w:w="4824"/>
+        <w:gridCol w:w="5328"/>
+      </w:tblGrid>
       <w:tr>
         <w:tc>
           <w:tcPr>
@@ -15223,12 +15214,6 @@
       </w:r>
     </w:p>
     <w:tbl>
-      <w:tblGrid>
-        <w:gridCol w:w="1584"/>
-        <w:gridCol w:w="2880"/>
-        <w:gridCol w:w="4824"/>
-        <w:gridCol w:w="5328"/>
-      </w:tblGrid>
       <w:tblPr>
         <w:tblStyle w:val="TableGrid"/>
         <w:tblW w:type="dxa" w:w="14616"/>
@@ -15236,6 +15221,12 @@
         <w:tblLook w:firstColumn="1" w:firstRow="1" w:lastColumn="0" w:lastRow="0" w:noHBand="0" w:noVBand="1" w:val="04A0"/>
         <w:tblLayout w:type="fixed"/>
       </w:tblPr>
+      <w:tblGrid>
+        <w:gridCol w:w="1584"/>
+        <w:gridCol w:w="2880"/>
+        <w:gridCol w:w="4824"/>
+        <w:gridCol w:w="5328"/>
+      </w:tblGrid>
       <w:tr>
         <w:tc>
           <w:tcPr>
@@ -18108,12 +18099,6 @@
       </w:r>
     </w:p>
     <w:tbl>
-      <w:tblGrid>
-        <w:gridCol w:w="1584"/>
-        <w:gridCol w:w="2880"/>
-        <w:gridCol w:w="4824"/>
-        <w:gridCol w:w="5328"/>
-      </w:tblGrid>
       <w:tblPr>
         <w:tblStyle w:val="TableGrid"/>
         <w:tblW w:type="dxa" w:w="14616"/>
@@ -18121,6 +18106,12 @@
         <w:tblLook w:firstColumn="1" w:firstRow="1" w:lastColumn="0" w:lastRow="0" w:noHBand="0" w:noVBand="1" w:val="04A0"/>
         <w:tblLayout w:type="fixed"/>
       </w:tblPr>
+      <w:tblGrid>
+        <w:gridCol w:w="1584"/>
+        <w:gridCol w:w="2880"/>
+        <w:gridCol w:w="4824"/>
+        <w:gridCol w:w="5328"/>
+      </w:tblGrid>
       <w:tr>
         <w:tc>
           <w:tcPr>
@@ -18841,12 +18832,6 @@
       </w:r>
     </w:p>
     <w:tbl>
-      <w:tblGrid>
-        <w:gridCol w:w="1584"/>
-        <w:gridCol w:w="2880"/>
-        <w:gridCol w:w="4824"/>
-        <w:gridCol w:w="5328"/>
-      </w:tblGrid>
       <w:tblPr>
         <w:tblStyle w:val="TableGrid"/>
         <w:tblW w:type="dxa" w:w="14616"/>
@@ -18854,6 +18839,12 @@
         <w:tblLook w:firstColumn="1" w:firstRow="1" w:lastColumn="0" w:lastRow="0" w:noHBand="0" w:noVBand="1" w:val="04A0"/>
         <w:tblLayout w:type="fixed"/>
       </w:tblPr>
+      <w:tblGrid>
+        <w:gridCol w:w="1584"/>
+        <w:gridCol w:w="2880"/>
+        <w:gridCol w:w="4824"/>
+        <w:gridCol w:w="5328"/>
+      </w:tblGrid>
       <w:tr>
         <w:tc>
           <w:tcPr>
@@ -19961,10 +19952,6 @@
       </w:r>
     </w:p>
     <w:tbl>
-      <w:tblGrid>
-        <w:gridCol w:w="2880"/>
-        <w:gridCol w:w="11664"/>
-      </w:tblGrid>
       <w:tblPr>
         <w:tblStyle w:val="TableGrid"/>
         <w:tblW w:type="dxa" w:w="14544"/>
@@ -19972,6 +19959,10 @@
         <w:tblLook w:firstColumn="1" w:firstRow="1" w:lastColumn="0" w:lastRow="0" w:noHBand="0" w:noVBand="1" w:val="04A0"/>
         <w:tblLayout w:type="fixed"/>
       </w:tblPr>
+      <w:tblGrid>
+        <w:gridCol w:w="2880"/>
+        <w:gridCol w:w="11664"/>
+      </w:tblGrid>
       <w:tr>
         <w:tc>
           <w:tcPr>
@@ -20715,10 +20706,6 @@
       </w:r>
     </w:p>
     <w:tbl>
-      <w:tblGrid>
-        <w:gridCol w:w="2880"/>
-        <w:gridCol w:w="11664"/>
-      </w:tblGrid>
       <w:tblPr>
         <w:tblStyle w:val="TableGrid"/>
         <w:tblW w:type="dxa" w:w="14544"/>
@@ -20726,6 +20713,10 @@
         <w:tblLook w:firstColumn="1" w:firstRow="1" w:lastColumn="0" w:lastRow="0" w:noHBand="0" w:noVBand="1" w:val="04A0"/>
         <w:tblLayout w:type="fixed"/>
       </w:tblPr>
+      <w:tblGrid>
+        <w:gridCol w:w="2880"/>
+        <w:gridCol w:w="11664"/>
+      </w:tblGrid>
       <w:tr>
         <w:tc>
           <w:tcPr>
@@ -21078,7 +21069,7 @@
                 <w:color w:val="111827"/>
                 <w:sz w:val="16"/>
               </w:rPr>
-              <w:t>BSC Testnet / 浏览器 / 钱包</w:t>
+              <w:t>BSC Mainnet / 浏览器 / 钱包</w:t>
             </w:r>
           </w:p>
         </w:tc>

</xml_diff>